<commit_message>
Save my local work
</commit_message>
<xml_diff>
--- a/Section4_DataBinding/1-Data Binding.docx
+++ b/Section4_DataBinding/1-Data Binding.docx
@@ -2017,7 +2017,6 @@
         <w:t>length: {{</w:t>
       </w:r>
       <w:proofErr w:type="spellStart"/>
-      <w:proofErr w:type="gramEnd"/>
       <w:r>
         <w:rPr>
           <w:rFonts w:ascii="Khmer OS Battambang" w:hAnsi="Khmer OS Battambang" w:cs="Khmer OS Battambang"/>
@@ -2033,7 +2032,34 @@
           <w:sz w:val="22"/>
           <w:szCs w:val="22"/>
         </w:rPr>
-        <w:t>?.length}}&lt;/p&gt;</w:t>
+        <w:t>?.</w:t>
+      </w:r>
+      <w:proofErr w:type="gramEnd"/>
+      <w:r>
+        <w:rPr>
+          <w:rFonts w:ascii="Khmer OS Battambang" w:hAnsi="Khmer OS Battambang" w:cs="Khmer OS Battambang"/>
+          <w:sz w:val="22"/>
+          <w:szCs w:val="22"/>
+        </w:rPr>
+        <w:t>length</w:t>
+      </w:r>
+      <w:proofErr w:type="gramStart"/>
+      <w:r>
+        <w:rPr>
+          <w:rFonts w:ascii="Khmer OS Battambang" w:hAnsi="Khmer OS Battambang" w:cs="Khmer OS Battambang"/>
+          <w:sz w:val="22"/>
+          <w:szCs w:val="22"/>
+        </w:rPr>
+        <w:t>}}&lt;</w:t>
+      </w:r>
+      <w:proofErr w:type="gramEnd"/>
+      <w:r>
+        <w:rPr>
+          <w:rFonts w:ascii="Khmer OS Battambang" w:hAnsi="Khmer OS Battambang" w:cs="Khmer OS Battambang"/>
+          <w:sz w:val="22"/>
+          <w:szCs w:val="22"/>
+        </w:rPr>
+        <w:t>/p&gt;</w:t>
       </w:r>
     </w:p>
     <w:p>
@@ -2242,6 +2268,7 @@
       <w:r>
         <w:rPr>
           <w:rFonts w:ascii="Khmer OS Battambang" w:hAnsi="Khmer OS Battambang" w:cs="Khmer OS Battambang"/>
+          <w:noProof/>
           <w:sz w:val="22"/>
           <w:szCs w:val="22"/>
         </w:rPr>
@@ -2782,12 +2809,13 @@
       <w:r>
         <w:rPr>
           <w:rFonts w:ascii="Khmer OS Battambang" w:hAnsi="Khmer OS Battambang" w:cs="Khmer OS Battambang"/>
+          <w:noProof/>
           <w:sz w:val="20"/>
           <w:szCs w:val="20"/>
         </w:rPr>
         <w:lastRenderedPageBreak/>
         <w:drawing>
-          <wp:anchor distT="0" distB="0" distL="114300" distR="114300" simplePos="0" relativeHeight="251664384" behindDoc="1" locked="0" layoutInCell="1" allowOverlap="1" wp14:anchorId="3733E32B" wp14:editId="0638AB5C">
+          <wp:anchor distT="0" distB="0" distL="114300" distR="114300" simplePos="0" relativeHeight="251664384" behindDoc="1" locked="0" layoutInCell="1" allowOverlap="1" wp14:anchorId="3733E32B" wp14:editId="436D82BF">
             <wp:simplePos x="0" y="0"/>
             <wp:positionH relativeFrom="column">
               <wp:posOffset>2094</wp:posOffset>
@@ -2841,52 +2869,52 @@
       <w:pPr>
         <w:jc w:val="both"/>
         <w:rPr>
-          <w:rFonts w:ascii="Khmer OS Battambang" w:hAnsi="Khmer OS Battambang" w:cs="Khmer OS Battambang" w:hint="cs"/>
-          <w:sz w:val="20"/>
-          <w:szCs w:val="20"/>
-        </w:rPr>
-      </w:pPr>
-    </w:p>
-    <w:p>
-      <w:pPr>
-        <w:rPr>
-          <w:rFonts w:ascii="Khmer OS Battambang" w:hAnsi="Khmer OS Battambang" w:cs="Khmer OS Battambang"/>
-          <w:sz w:val="20"/>
-          <w:szCs w:val="20"/>
-        </w:rPr>
-      </w:pPr>
-    </w:p>
-    <w:p>
-      <w:pPr>
-        <w:rPr>
-          <w:rFonts w:ascii="Khmer OS Battambang" w:hAnsi="Khmer OS Battambang" w:cs="Khmer OS Battambang"/>
-          <w:sz w:val="20"/>
-          <w:szCs w:val="20"/>
-        </w:rPr>
-      </w:pPr>
-    </w:p>
-    <w:p>
-      <w:pPr>
-        <w:rPr>
-          <w:rFonts w:ascii="Khmer OS Battambang" w:hAnsi="Khmer OS Battambang" w:cs="Khmer OS Battambang"/>
-          <w:sz w:val="20"/>
-          <w:szCs w:val="20"/>
-        </w:rPr>
-      </w:pPr>
-    </w:p>
-    <w:p>
-      <w:pPr>
-        <w:rPr>
-          <w:rFonts w:ascii="Khmer OS Battambang" w:hAnsi="Khmer OS Battambang" w:cs="Khmer OS Battambang"/>
-          <w:sz w:val="20"/>
-          <w:szCs w:val="20"/>
-        </w:rPr>
-      </w:pPr>
-    </w:p>
-    <w:p>
-      <w:pPr>
-        <w:rPr>
-          <w:rFonts w:ascii="Khmer OS Battambang" w:hAnsi="Khmer OS Battambang" w:cs="Khmer OS Battambang" w:hint="cs"/>
+          <w:rFonts w:ascii="Khmer OS Battambang" w:hAnsi="Khmer OS Battambang" w:cs="Khmer OS Battambang"/>
+          <w:sz w:val="20"/>
+          <w:szCs w:val="20"/>
+        </w:rPr>
+      </w:pPr>
+    </w:p>
+    <w:p>
+      <w:pPr>
+        <w:rPr>
+          <w:rFonts w:ascii="Khmer OS Battambang" w:hAnsi="Khmer OS Battambang" w:cs="Khmer OS Battambang"/>
+          <w:sz w:val="20"/>
+          <w:szCs w:val="20"/>
+        </w:rPr>
+      </w:pPr>
+    </w:p>
+    <w:p>
+      <w:pPr>
+        <w:rPr>
+          <w:rFonts w:ascii="Khmer OS Battambang" w:hAnsi="Khmer OS Battambang" w:cs="Khmer OS Battambang"/>
+          <w:sz w:val="20"/>
+          <w:szCs w:val="20"/>
+        </w:rPr>
+      </w:pPr>
+    </w:p>
+    <w:p>
+      <w:pPr>
+        <w:rPr>
+          <w:rFonts w:ascii="Khmer OS Battambang" w:hAnsi="Khmer OS Battambang" w:cs="Khmer OS Battambang"/>
+          <w:sz w:val="20"/>
+          <w:szCs w:val="20"/>
+        </w:rPr>
+      </w:pPr>
+    </w:p>
+    <w:p>
+      <w:pPr>
+        <w:rPr>
+          <w:rFonts w:ascii="Khmer OS Battambang" w:hAnsi="Khmer OS Battambang" w:cs="Khmer OS Battambang"/>
+          <w:sz w:val="20"/>
+          <w:szCs w:val="20"/>
+        </w:rPr>
+      </w:pPr>
+    </w:p>
+    <w:p>
+      <w:pPr>
+        <w:rPr>
+          <w:rFonts w:ascii="Khmer OS Battambang" w:hAnsi="Khmer OS Battambang" w:cs="Khmer OS Battambang"/>
           <w:sz w:val="20"/>
           <w:szCs w:val="20"/>
         </w:rPr>
@@ -3418,6 +3446,7 @@
       <w:r>
         <w:rPr>
           <w:rFonts w:ascii="Khmer OS Battambang" w:hAnsi="Khmer OS Battambang" w:cs="Khmer OS Battambang"/>
+          <w:noProof/>
           <w:sz w:val="20"/>
           <w:szCs w:val="20"/>
         </w:rPr>
@@ -3484,88 +3513,88 @@
     <w:p>
       <w:pPr>
         <w:rPr>
-          <w:rFonts w:ascii="Khmer OS Battambang" w:hAnsi="Khmer OS Battambang" w:cs="Khmer OS Battambang" w:hint="cs"/>
-          <w:sz w:val="20"/>
-          <w:szCs w:val="20"/>
-        </w:rPr>
-      </w:pPr>
-    </w:p>
-    <w:p>
-      <w:pPr>
-        <w:rPr>
-          <w:rFonts w:ascii="Khmer OS Battambang" w:hAnsi="Khmer OS Battambang" w:cs="Khmer OS Battambang"/>
-          <w:sz w:val="20"/>
-          <w:szCs w:val="20"/>
-        </w:rPr>
-      </w:pPr>
-    </w:p>
-    <w:p>
-      <w:pPr>
-        <w:rPr>
-          <w:rFonts w:ascii="Khmer OS Battambang" w:hAnsi="Khmer OS Battambang" w:cs="Khmer OS Battambang"/>
-          <w:sz w:val="20"/>
-          <w:szCs w:val="20"/>
-        </w:rPr>
-      </w:pPr>
-    </w:p>
-    <w:p>
-      <w:pPr>
-        <w:rPr>
-          <w:rFonts w:ascii="Khmer OS Battambang" w:hAnsi="Khmer OS Battambang" w:cs="Khmer OS Battambang"/>
-          <w:sz w:val="20"/>
-          <w:szCs w:val="20"/>
-        </w:rPr>
-      </w:pPr>
-    </w:p>
-    <w:p>
-      <w:pPr>
-        <w:rPr>
-          <w:rFonts w:ascii="Khmer OS Battambang" w:hAnsi="Khmer OS Battambang" w:cs="Khmer OS Battambang"/>
-          <w:sz w:val="20"/>
-          <w:szCs w:val="20"/>
-        </w:rPr>
-      </w:pPr>
-    </w:p>
-    <w:p>
-      <w:pPr>
-        <w:rPr>
-          <w:rFonts w:ascii="Khmer OS Battambang" w:hAnsi="Khmer OS Battambang" w:cs="Khmer OS Battambang"/>
-          <w:sz w:val="20"/>
-          <w:szCs w:val="20"/>
-        </w:rPr>
-      </w:pPr>
-    </w:p>
-    <w:p>
-      <w:pPr>
-        <w:rPr>
-          <w:rFonts w:ascii="Khmer OS Battambang" w:hAnsi="Khmer OS Battambang" w:cs="Khmer OS Battambang"/>
-          <w:sz w:val="20"/>
-          <w:szCs w:val="20"/>
-        </w:rPr>
-      </w:pPr>
-    </w:p>
-    <w:p>
-      <w:pPr>
-        <w:rPr>
-          <w:rFonts w:ascii="Khmer OS Battambang" w:hAnsi="Khmer OS Battambang" w:cs="Khmer OS Battambang"/>
-          <w:sz w:val="20"/>
-          <w:szCs w:val="20"/>
-        </w:rPr>
-      </w:pPr>
-    </w:p>
-    <w:p>
-      <w:pPr>
-        <w:rPr>
-          <w:rFonts w:ascii="Khmer OS Battambang" w:hAnsi="Khmer OS Battambang" w:cs="Khmer OS Battambang"/>
-          <w:sz w:val="20"/>
-          <w:szCs w:val="20"/>
-        </w:rPr>
-      </w:pPr>
-    </w:p>
-    <w:p>
-      <w:pPr>
-        <w:rPr>
-          <w:rFonts w:ascii="Khmer OS Battambang" w:hAnsi="Khmer OS Battambang" w:cs="Khmer OS Battambang" w:hint="cs"/>
+          <w:rFonts w:ascii="Khmer OS Battambang" w:hAnsi="Khmer OS Battambang" w:cs="Khmer OS Battambang"/>
+          <w:sz w:val="20"/>
+          <w:szCs w:val="20"/>
+        </w:rPr>
+      </w:pPr>
+    </w:p>
+    <w:p>
+      <w:pPr>
+        <w:rPr>
+          <w:rFonts w:ascii="Khmer OS Battambang" w:hAnsi="Khmer OS Battambang" w:cs="Khmer OS Battambang"/>
+          <w:sz w:val="20"/>
+          <w:szCs w:val="20"/>
+        </w:rPr>
+      </w:pPr>
+    </w:p>
+    <w:p>
+      <w:pPr>
+        <w:rPr>
+          <w:rFonts w:ascii="Khmer OS Battambang" w:hAnsi="Khmer OS Battambang" w:cs="Khmer OS Battambang"/>
+          <w:sz w:val="20"/>
+          <w:szCs w:val="20"/>
+        </w:rPr>
+      </w:pPr>
+    </w:p>
+    <w:p>
+      <w:pPr>
+        <w:rPr>
+          <w:rFonts w:ascii="Khmer OS Battambang" w:hAnsi="Khmer OS Battambang" w:cs="Khmer OS Battambang"/>
+          <w:sz w:val="20"/>
+          <w:szCs w:val="20"/>
+        </w:rPr>
+      </w:pPr>
+    </w:p>
+    <w:p>
+      <w:pPr>
+        <w:rPr>
+          <w:rFonts w:ascii="Khmer OS Battambang" w:hAnsi="Khmer OS Battambang" w:cs="Khmer OS Battambang"/>
+          <w:sz w:val="20"/>
+          <w:szCs w:val="20"/>
+        </w:rPr>
+      </w:pPr>
+    </w:p>
+    <w:p>
+      <w:pPr>
+        <w:rPr>
+          <w:rFonts w:ascii="Khmer OS Battambang" w:hAnsi="Khmer OS Battambang" w:cs="Khmer OS Battambang"/>
+          <w:sz w:val="20"/>
+          <w:szCs w:val="20"/>
+        </w:rPr>
+      </w:pPr>
+    </w:p>
+    <w:p>
+      <w:pPr>
+        <w:rPr>
+          <w:rFonts w:ascii="Khmer OS Battambang" w:hAnsi="Khmer OS Battambang" w:cs="Khmer OS Battambang"/>
+          <w:sz w:val="20"/>
+          <w:szCs w:val="20"/>
+        </w:rPr>
+      </w:pPr>
+    </w:p>
+    <w:p>
+      <w:pPr>
+        <w:rPr>
+          <w:rFonts w:ascii="Khmer OS Battambang" w:hAnsi="Khmer OS Battambang" w:cs="Khmer OS Battambang"/>
+          <w:sz w:val="20"/>
+          <w:szCs w:val="20"/>
+        </w:rPr>
+      </w:pPr>
+    </w:p>
+    <w:p>
+      <w:pPr>
+        <w:rPr>
+          <w:rFonts w:ascii="Khmer OS Battambang" w:hAnsi="Khmer OS Battambang" w:cs="Khmer OS Battambang"/>
+          <w:sz w:val="20"/>
+          <w:szCs w:val="20"/>
+        </w:rPr>
+      </w:pPr>
+    </w:p>
+    <w:p>
+      <w:pPr>
+        <w:rPr>
+          <w:rFonts w:ascii="Khmer OS Battambang" w:hAnsi="Khmer OS Battambang" w:cs="Khmer OS Battambang"/>
           <w:sz w:val="20"/>
           <w:szCs w:val="20"/>
         </w:rPr>
@@ -3666,6 +3695,7 @@
       <w:r>
         <w:rPr>
           <w:rFonts w:ascii="Khmer OS Battambang" w:hAnsi="Khmer OS Battambang" w:cs="Khmer OS Battambang"/>
+          <w:noProof/>
           <w:sz w:val="20"/>
           <w:szCs w:val="20"/>
         </w:rPr>
@@ -3991,6 +4021,7 @@
       <w:r>
         <w:rPr>
           <w:rFonts w:ascii="Khmer OS Battambang" w:hAnsi="Khmer OS Battambang" w:cs="Khmer OS Battambang"/>
+          <w:noProof/>
           <w:sz w:val="20"/>
           <w:szCs w:val="20"/>
           <w:cs/>
@@ -4068,124 +4099,124 @@
     <w:p>
       <w:pPr>
         <w:rPr>
-          <w:rFonts w:ascii="Khmer OS Battambang" w:hAnsi="Khmer OS Battambang" w:cs="Khmer OS Battambang" w:hint="cs"/>
-          <w:sz w:val="20"/>
-          <w:szCs w:val="20"/>
-        </w:rPr>
-      </w:pPr>
-    </w:p>
-    <w:p>
-      <w:pPr>
-        <w:rPr>
-          <w:rFonts w:ascii="Khmer OS Battambang" w:hAnsi="Khmer OS Battambang" w:cs="Khmer OS Battambang"/>
-          <w:sz w:val="20"/>
-          <w:szCs w:val="20"/>
-        </w:rPr>
-      </w:pPr>
-    </w:p>
-    <w:p>
-      <w:pPr>
-        <w:rPr>
-          <w:rFonts w:ascii="Khmer OS Battambang" w:hAnsi="Khmer OS Battambang" w:cs="Khmer OS Battambang"/>
-          <w:sz w:val="20"/>
-          <w:szCs w:val="20"/>
-        </w:rPr>
-      </w:pPr>
-    </w:p>
-    <w:p>
-      <w:pPr>
-        <w:rPr>
-          <w:rFonts w:ascii="Khmer OS Battambang" w:hAnsi="Khmer OS Battambang" w:cs="Khmer OS Battambang"/>
-          <w:sz w:val="20"/>
-          <w:szCs w:val="20"/>
-        </w:rPr>
-      </w:pPr>
-    </w:p>
-    <w:p>
-      <w:pPr>
-        <w:rPr>
-          <w:rFonts w:ascii="Khmer OS Battambang" w:hAnsi="Khmer OS Battambang" w:cs="Khmer OS Battambang"/>
-          <w:sz w:val="20"/>
-          <w:szCs w:val="20"/>
-        </w:rPr>
-      </w:pPr>
-    </w:p>
-    <w:p>
-      <w:pPr>
-        <w:rPr>
-          <w:rFonts w:ascii="Khmer OS Battambang" w:hAnsi="Khmer OS Battambang" w:cs="Khmer OS Battambang"/>
-          <w:sz w:val="20"/>
-          <w:szCs w:val="20"/>
-        </w:rPr>
-      </w:pPr>
-    </w:p>
-    <w:p>
-      <w:pPr>
-        <w:rPr>
-          <w:rFonts w:ascii="Khmer OS Battambang" w:hAnsi="Khmer OS Battambang" w:cs="Khmer OS Battambang"/>
-          <w:sz w:val="20"/>
-          <w:szCs w:val="20"/>
-        </w:rPr>
-      </w:pPr>
-    </w:p>
-    <w:p>
-      <w:pPr>
-        <w:rPr>
-          <w:rFonts w:ascii="Khmer OS Battambang" w:hAnsi="Khmer OS Battambang" w:cs="Khmer OS Battambang"/>
-          <w:sz w:val="20"/>
-          <w:szCs w:val="20"/>
-        </w:rPr>
-      </w:pPr>
-    </w:p>
-    <w:p>
-      <w:pPr>
-        <w:rPr>
-          <w:rFonts w:ascii="Khmer OS Battambang" w:hAnsi="Khmer OS Battambang" w:cs="Khmer OS Battambang"/>
-          <w:sz w:val="20"/>
-          <w:szCs w:val="20"/>
-        </w:rPr>
-      </w:pPr>
-    </w:p>
-    <w:p>
-      <w:pPr>
-        <w:rPr>
-          <w:rFonts w:ascii="Khmer OS Battambang" w:hAnsi="Khmer OS Battambang" w:cs="Khmer OS Battambang"/>
-          <w:sz w:val="20"/>
-          <w:szCs w:val="20"/>
-        </w:rPr>
-      </w:pPr>
-    </w:p>
-    <w:p>
-      <w:pPr>
-        <w:rPr>
-          <w:rFonts w:ascii="Khmer OS Battambang" w:hAnsi="Khmer OS Battambang" w:cs="Khmer OS Battambang"/>
-          <w:sz w:val="20"/>
-          <w:szCs w:val="20"/>
-        </w:rPr>
-      </w:pPr>
-    </w:p>
-    <w:p>
-      <w:pPr>
-        <w:rPr>
-          <w:rFonts w:ascii="Khmer OS Battambang" w:hAnsi="Khmer OS Battambang" w:cs="Khmer OS Battambang"/>
-          <w:sz w:val="20"/>
-          <w:szCs w:val="20"/>
-        </w:rPr>
-      </w:pPr>
-    </w:p>
-    <w:p>
-      <w:pPr>
-        <w:rPr>
-          <w:rFonts w:ascii="Khmer OS Battambang" w:hAnsi="Khmer OS Battambang" w:cs="Khmer OS Battambang"/>
-          <w:sz w:val="20"/>
-          <w:szCs w:val="20"/>
-        </w:rPr>
-      </w:pPr>
-    </w:p>
-    <w:p>
-      <w:pPr>
-        <w:rPr>
-          <w:rFonts w:ascii="Khmer OS Battambang" w:hAnsi="Khmer OS Battambang" w:cs="Khmer OS Battambang" w:hint="cs"/>
+          <w:rFonts w:ascii="Khmer OS Battambang" w:hAnsi="Khmer OS Battambang" w:cs="Khmer OS Battambang"/>
+          <w:sz w:val="20"/>
+          <w:szCs w:val="20"/>
+        </w:rPr>
+      </w:pPr>
+    </w:p>
+    <w:p>
+      <w:pPr>
+        <w:rPr>
+          <w:rFonts w:ascii="Khmer OS Battambang" w:hAnsi="Khmer OS Battambang" w:cs="Khmer OS Battambang"/>
+          <w:sz w:val="20"/>
+          <w:szCs w:val="20"/>
+        </w:rPr>
+      </w:pPr>
+    </w:p>
+    <w:p>
+      <w:pPr>
+        <w:rPr>
+          <w:rFonts w:ascii="Khmer OS Battambang" w:hAnsi="Khmer OS Battambang" w:cs="Khmer OS Battambang"/>
+          <w:sz w:val="20"/>
+          <w:szCs w:val="20"/>
+        </w:rPr>
+      </w:pPr>
+    </w:p>
+    <w:p>
+      <w:pPr>
+        <w:rPr>
+          <w:rFonts w:ascii="Khmer OS Battambang" w:hAnsi="Khmer OS Battambang" w:cs="Khmer OS Battambang"/>
+          <w:sz w:val="20"/>
+          <w:szCs w:val="20"/>
+        </w:rPr>
+      </w:pPr>
+    </w:p>
+    <w:p>
+      <w:pPr>
+        <w:rPr>
+          <w:rFonts w:ascii="Khmer OS Battambang" w:hAnsi="Khmer OS Battambang" w:cs="Khmer OS Battambang"/>
+          <w:sz w:val="20"/>
+          <w:szCs w:val="20"/>
+        </w:rPr>
+      </w:pPr>
+    </w:p>
+    <w:p>
+      <w:pPr>
+        <w:rPr>
+          <w:rFonts w:ascii="Khmer OS Battambang" w:hAnsi="Khmer OS Battambang" w:cs="Khmer OS Battambang"/>
+          <w:sz w:val="20"/>
+          <w:szCs w:val="20"/>
+        </w:rPr>
+      </w:pPr>
+    </w:p>
+    <w:p>
+      <w:pPr>
+        <w:rPr>
+          <w:rFonts w:ascii="Khmer OS Battambang" w:hAnsi="Khmer OS Battambang" w:cs="Khmer OS Battambang"/>
+          <w:sz w:val="20"/>
+          <w:szCs w:val="20"/>
+        </w:rPr>
+      </w:pPr>
+    </w:p>
+    <w:p>
+      <w:pPr>
+        <w:rPr>
+          <w:rFonts w:ascii="Khmer OS Battambang" w:hAnsi="Khmer OS Battambang" w:cs="Khmer OS Battambang"/>
+          <w:sz w:val="20"/>
+          <w:szCs w:val="20"/>
+        </w:rPr>
+      </w:pPr>
+    </w:p>
+    <w:p>
+      <w:pPr>
+        <w:rPr>
+          <w:rFonts w:ascii="Khmer OS Battambang" w:hAnsi="Khmer OS Battambang" w:cs="Khmer OS Battambang"/>
+          <w:sz w:val="20"/>
+          <w:szCs w:val="20"/>
+        </w:rPr>
+      </w:pPr>
+    </w:p>
+    <w:p>
+      <w:pPr>
+        <w:rPr>
+          <w:rFonts w:ascii="Khmer OS Battambang" w:hAnsi="Khmer OS Battambang" w:cs="Khmer OS Battambang"/>
+          <w:sz w:val="20"/>
+          <w:szCs w:val="20"/>
+        </w:rPr>
+      </w:pPr>
+    </w:p>
+    <w:p>
+      <w:pPr>
+        <w:rPr>
+          <w:rFonts w:ascii="Khmer OS Battambang" w:hAnsi="Khmer OS Battambang" w:cs="Khmer OS Battambang"/>
+          <w:sz w:val="20"/>
+          <w:szCs w:val="20"/>
+        </w:rPr>
+      </w:pPr>
+    </w:p>
+    <w:p>
+      <w:pPr>
+        <w:rPr>
+          <w:rFonts w:ascii="Khmer OS Battambang" w:hAnsi="Khmer OS Battambang" w:cs="Khmer OS Battambang"/>
+          <w:sz w:val="20"/>
+          <w:szCs w:val="20"/>
+        </w:rPr>
+      </w:pPr>
+    </w:p>
+    <w:p>
+      <w:pPr>
+        <w:rPr>
+          <w:rFonts w:ascii="Khmer OS Battambang" w:hAnsi="Khmer OS Battambang" w:cs="Khmer OS Battambang"/>
+          <w:sz w:val="20"/>
+          <w:szCs w:val="20"/>
+        </w:rPr>
+      </w:pPr>
+    </w:p>
+    <w:p>
+      <w:pPr>
+        <w:rPr>
+          <w:rFonts w:ascii="Khmer OS Battambang" w:hAnsi="Khmer OS Battambang" w:cs="Khmer OS Battambang"/>
           <w:sz w:val="20"/>
           <w:szCs w:val="20"/>
         </w:rPr>
@@ -4323,6 +4354,7 @@
       <w:r>
         <w:rPr>
           <w:rFonts w:ascii="Khmer OS Battambang" w:hAnsi="Khmer OS Battambang" w:cs="Khmer OS Battambang"/>
+          <w:noProof/>
           <w:sz w:val="20"/>
           <w:szCs w:val="20"/>
         </w:rPr>
@@ -4956,10 +4988,1015 @@
       <w:pPr>
         <w:rPr>
           <w:rFonts w:ascii="Khmer OS Battambang" w:hAnsi="Khmer OS Battambang" w:cs="Khmer OS Battambang"/>
-          <w:sz w:val="20"/>
-          <w:szCs w:val="20"/>
-        </w:rPr>
-      </w:pPr>
+          <w:sz w:val="28"/>
+          <w:szCs w:val="28"/>
+        </w:rPr>
+      </w:pPr>
+      <w:r>
+        <w:rPr>
+          <w:rFonts w:ascii="Khmer OS Battambang" w:hAnsi="Khmer OS Battambang" w:cs="Khmer OS Battambang"/>
+          <w:sz w:val="28"/>
+          <w:szCs w:val="28"/>
+        </w:rPr>
+        <w:lastRenderedPageBreak/>
+        <w:t>Example on the even binding with real time update:</w:t>
+      </w:r>
+    </w:p>
+    <w:p>
+      <w:pPr>
+        <w:ind w:firstLine="720"/>
+        <w:rPr>
+          <w:rFonts w:ascii="Khmer OS Battambang" w:hAnsi="Khmer OS Battambang" w:cs="Khmer OS Battambang"/>
+          <w:sz w:val="24"/>
+          <w:szCs w:val="24"/>
+        </w:rPr>
+      </w:pPr>
+      <w:r>
+        <w:rPr>
+          <w:rFonts w:ascii="Khmer OS Battambang" w:hAnsi="Khmer OS Battambang" w:cs="Khmer OS Battambang"/>
+          <w:sz w:val="24"/>
+          <w:szCs w:val="24"/>
+        </w:rPr>
+        <w:t> &lt;</w:t>
+      </w:r>
+      <w:proofErr w:type="spellStart"/>
+      <w:r>
+        <w:rPr>
+          <w:rFonts w:ascii="Khmer OS Battambang" w:hAnsi="Khmer OS Battambang" w:cs="Khmer OS Battambang"/>
+          <w:sz w:val="24"/>
+          <w:szCs w:val="24"/>
+        </w:rPr>
+        <w:t>th</w:t>
+      </w:r>
+      <w:proofErr w:type="spellEnd"/>
+      <w:r>
+        <w:rPr>
+          <w:rFonts w:ascii="Khmer OS Battambang" w:hAnsi="Khmer OS Battambang" w:cs="Khmer OS Battambang"/>
+          <w:sz w:val="24"/>
+          <w:szCs w:val="24"/>
+        </w:rPr>
+        <w:t>&gt;&lt;input type="number" [value]="</w:t>
+      </w:r>
+      <w:proofErr w:type="spellStart"/>
+      <w:r>
+        <w:rPr>
+          <w:rFonts w:ascii="Khmer OS Battambang" w:hAnsi="Khmer OS Battambang" w:cs="Khmer OS Battambang"/>
+          <w:sz w:val="24"/>
+          <w:szCs w:val="24"/>
+        </w:rPr>
+        <w:t>monthlyAmount</w:t>
+      </w:r>
+      <w:proofErr w:type="spellEnd"/>
+      <w:r>
+        <w:rPr>
+          <w:rFonts w:ascii="Khmer OS Battambang" w:hAnsi="Khmer OS Battambang" w:cs="Khmer OS Battambang"/>
+          <w:sz w:val="24"/>
+          <w:szCs w:val="24"/>
+        </w:rPr>
+        <w:t xml:space="preserve">" </w:t>
+      </w:r>
+    </w:p>
+    <w:p>
+      <w:pPr>
+        <w:rPr>
+          <w:rFonts w:ascii="Khmer OS Battambang" w:hAnsi="Khmer OS Battambang" w:cs="Khmer OS Battambang"/>
+          <w:sz w:val="24"/>
+          <w:szCs w:val="24"/>
+        </w:rPr>
+      </w:pPr>
+      <w:r>
+        <w:rPr>
+          <w:rFonts w:ascii="Khmer OS Battambang" w:hAnsi="Khmer OS Battambang" w:cs="Khmer OS Battambang"/>
+          <w:sz w:val="24"/>
+          <w:szCs w:val="24"/>
+        </w:rPr>
+        <w:t>                    (input)="</w:t>
+      </w:r>
+      <w:proofErr w:type="spellStart"/>
+      <w:r>
+        <w:rPr>
+          <w:rFonts w:ascii="Khmer OS Battambang" w:hAnsi="Khmer OS Battambang" w:cs="Khmer OS Battambang"/>
+          <w:sz w:val="24"/>
+          <w:szCs w:val="24"/>
+        </w:rPr>
+        <w:t>updateMonthlyAmount</w:t>
+      </w:r>
+      <w:proofErr w:type="spellEnd"/>
+      <w:r>
+        <w:rPr>
+          <w:rFonts w:ascii="Khmer OS Battambang" w:hAnsi="Khmer OS Battambang" w:cs="Khmer OS Battambang"/>
+          <w:sz w:val="24"/>
+          <w:szCs w:val="24"/>
+        </w:rPr>
+        <w:t>($event)"&gt;</w:t>
+      </w:r>
+    </w:p>
+    <w:p>
+      <w:pPr>
+        <w:rPr>
+          <w:rFonts w:ascii="Khmer OS Battambang" w:hAnsi="Khmer OS Battambang" w:cs="Khmer OS Battambang"/>
+          <w:sz w:val="24"/>
+          <w:szCs w:val="24"/>
+        </w:rPr>
+      </w:pPr>
+      <w:r>
+        <w:rPr>
+          <w:rFonts w:ascii="Khmer OS Battambang" w:hAnsi="Khmer OS Battambang" w:cs="Khmer OS Battambang"/>
+          <w:sz w:val="24"/>
+          <w:szCs w:val="24"/>
+        </w:rPr>
+        <w:t xml:space="preserve">                    &lt;p&gt;Current </w:t>
+      </w:r>
+      <w:proofErr w:type="gramStart"/>
+      <w:r>
+        <w:rPr>
+          <w:rFonts w:ascii="Khmer OS Battambang" w:hAnsi="Khmer OS Battambang" w:cs="Khmer OS Battambang"/>
+          <w:sz w:val="24"/>
+          <w:szCs w:val="24"/>
+        </w:rPr>
+        <w:t>value: {{</w:t>
+      </w:r>
+      <w:proofErr w:type="spellStart"/>
+      <w:proofErr w:type="gramEnd"/>
+      <w:r>
+        <w:rPr>
+          <w:rFonts w:ascii="Khmer OS Battambang" w:hAnsi="Khmer OS Battambang" w:cs="Khmer OS Battambang"/>
+          <w:sz w:val="24"/>
+          <w:szCs w:val="24"/>
+        </w:rPr>
+        <w:t>monthlyAmount</w:t>
+      </w:r>
+      <w:proofErr w:type="spellEnd"/>
+      <w:proofErr w:type="gramStart"/>
+      <w:r>
+        <w:rPr>
+          <w:rFonts w:ascii="Khmer OS Battambang" w:hAnsi="Khmer OS Battambang" w:cs="Khmer OS Battambang"/>
+          <w:sz w:val="24"/>
+          <w:szCs w:val="24"/>
+        </w:rPr>
+        <w:t>}}&lt;</w:t>
+      </w:r>
+      <w:proofErr w:type="gramEnd"/>
+      <w:r>
+        <w:rPr>
+          <w:rFonts w:ascii="Khmer OS Battambang" w:hAnsi="Khmer OS Battambang" w:cs="Khmer OS Battambang"/>
+          <w:sz w:val="24"/>
+          <w:szCs w:val="24"/>
+        </w:rPr>
+        <w:t>/p&gt;</w:t>
+      </w:r>
+    </w:p>
+    <w:p>
+      <w:pPr>
+        <w:rPr>
+          <w:rFonts w:ascii="Khmer OS Battambang" w:hAnsi="Khmer OS Battambang" w:cs="Khmer OS Battambang"/>
+          <w:sz w:val="24"/>
+          <w:szCs w:val="24"/>
+        </w:rPr>
+      </w:pPr>
+      <w:r>
+        <w:rPr>
+          <w:rFonts w:ascii="Khmer OS Battambang" w:hAnsi="Khmer OS Battambang" w:cs="Khmer OS Battambang"/>
+          <w:sz w:val="24"/>
+          <w:szCs w:val="24"/>
+        </w:rPr>
+        <w:t>                &lt;/</w:t>
+      </w:r>
+      <w:proofErr w:type="spellStart"/>
+      <w:r>
+        <w:rPr>
+          <w:rFonts w:ascii="Khmer OS Battambang" w:hAnsi="Khmer OS Battambang" w:cs="Khmer OS Battambang"/>
+          <w:sz w:val="24"/>
+          <w:szCs w:val="24"/>
+        </w:rPr>
+        <w:t>th</w:t>
+      </w:r>
+      <w:proofErr w:type="spellEnd"/>
+      <w:r>
+        <w:rPr>
+          <w:rFonts w:ascii="Khmer OS Battambang" w:hAnsi="Khmer OS Battambang" w:cs="Khmer OS Battambang"/>
+          <w:sz w:val="24"/>
+          <w:szCs w:val="24"/>
+        </w:rPr>
+        <w:t>&gt;</w:t>
+      </w:r>
+    </w:p>
+    <w:p>
+      <w:pPr>
+        <w:pStyle w:val="ListParagraph"/>
+        <w:numPr>
+          <w:ilvl w:val="0"/>
+          <w:numId w:val="4"/>
+        </w:numPr>
+        <w:rPr>
+          <w:rFonts w:ascii="Khmer OS Battambang" w:hAnsi="Khmer OS Battambang" w:cs="Khmer OS Battambang"/>
+          <w:sz w:val="20"/>
+          <w:szCs w:val="20"/>
+        </w:rPr>
+      </w:pPr>
+      <w:r>
+        <w:rPr>
+          <w:rFonts w:ascii="Khmer OS Battambang" w:hAnsi="Khmer OS Battambang" w:cs="Khmer OS Battambang"/>
+          <w:sz w:val="24"/>
+          <w:szCs w:val="24"/>
+        </w:rPr>
+        <w:t>input type="number</w:t>
+      </w:r>
+      <w:proofErr w:type="gramStart"/>
+      <w:r>
+        <w:rPr>
+          <w:rFonts w:ascii="Khmer OS Battambang" w:hAnsi="Khmer OS Battambang" w:cs="Khmer OS Battambang"/>
+          <w:sz w:val="24"/>
+          <w:szCs w:val="24"/>
+        </w:rPr>
+        <w:t>"</w:t>
+      </w:r>
+      <w:r>
+        <w:rPr>
+          <w:rFonts w:ascii="Khmer OS Battambang" w:hAnsi="Khmer OS Battambang" w:cs="Khmer OS Battambang"/>
+          <w:sz w:val="24"/>
+          <w:szCs w:val="24"/>
+        </w:rPr>
+        <w:t xml:space="preserve"> :</w:t>
+      </w:r>
+      <w:proofErr w:type="gramEnd"/>
+      <w:r>
+        <w:rPr>
+          <w:rFonts w:ascii="Khmer OS Battambang" w:hAnsi="Khmer OS Battambang" w:cs="Khmer OS Battambang"/>
+          <w:sz w:val="24"/>
+          <w:szCs w:val="24"/>
+        </w:rPr>
+        <w:t xml:space="preserve"> </w:t>
+      </w:r>
+      <w:r>
+        <w:rPr>
+          <w:rFonts w:ascii="Khmer OS Battambang" w:hAnsi="Khmer OS Battambang" w:cs="Khmer OS Battambang" w:hint="cs"/>
+          <w:sz w:val="24"/>
+          <w:szCs w:val="24"/>
+          <w:cs/>
+        </w:rPr>
+        <w:t xml:space="preserve">ការបញ្ចូលវាជា ប្រភេទ </w:t>
+      </w:r>
+      <w:r>
+        <w:rPr>
+          <w:rFonts w:ascii="Khmer OS Battambang" w:hAnsi="Khmer OS Battambang" w:cs="Khmer OS Battambang"/>
+          <w:sz w:val="24"/>
+          <w:szCs w:val="24"/>
+        </w:rPr>
+        <w:t xml:space="preserve">number </w:t>
+      </w:r>
+    </w:p>
+    <w:p>
+      <w:pPr>
+        <w:pStyle w:val="ListParagraph"/>
+        <w:numPr>
+          <w:ilvl w:val="0"/>
+          <w:numId w:val="4"/>
+        </w:numPr>
+        <w:rPr>
+          <w:rFonts w:ascii="Khmer OS Battambang" w:hAnsi="Khmer OS Battambang" w:cs="Khmer OS Battambang"/>
+          <w:sz w:val="20"/>
+          <w:szCs w:val="20"/>
+        </w:rPr>
+      </w:pPr>
+      <w:r>
+        <w:rPr>
+          <w:rFonts w:ascii="Khmer OS Battambang" w:hAnsi="Khmer OS Battambang" w:cs="Khmer OS Battambang"/>
+          <w:sz w:val="24"/>
+          <w:szCs w:val="24"/>
+        </w:rPr>
+        <w:t>[value]="</w:t>
+      </w:r>
+      <w:proofErr w:type="spellStart"/>
+      <w:r>
+        <w:rPr>
+          <w:rFonts w:ascii="Khmer OS Battambang" w:hAnsi="Khmer OS Battambang" w:cs="Khmer OS Battambang"/>
+          <w:sz w:val="24"/>
+          <w:szCs w:val="24"/>
+        </w:rPr>
+        <w:t>monthlyAmount</w:t>
+      </w:r>
+      <w:proofErr w:type="spellEnd"/>
+      <w:proofErr w:type="gramStart"/>
+      <w:r>
+        <w:rPr>
+          <w:rFonts w:ascii="Khmer OS Battambang" w:hAnsi="Khmer OS Battambang" w:cs="Khmer OS Battambang"/>
+          <w:sz w:val="24"/>
+          <w:szCs w:val="24"/>
+        </w:rPr>
+        <w:t>"</w:t>
+      </w:r>
+      <w:r>
+        <w:rPr>
+          <w:rFonts w:ascii="Khmer OS Battambang" w:hAnsi="Khmer OS Battambang" w:cs="Khmer OS Battambang"/>
+          <w:sz w:val="24"/>
+          <w:szCs w:val="24"/>
+        </w:rPr>
+        <w:t xml:space="preserve"> :</w:t>
+      </w:r>
+      <w:proofErr w:type="gramEnd"/>
+      <w:r>
+        <w:rPr>
+          <w:rFonts w:ascii="Khmer OS Battambang" w:hAnsi="Khmer OS Battambang" w:cs="Khmer OS Battambang"/>
+          <w:sz w:val="24"/>
+          <w:szCs w:val="24"/>
+        </w:rPr>
+        <w:t xml:space="preserve"> it is the properties binding </w:t>
+      </w:r>
+      <w:r>
+        <w:rPr>
+          <w:rFonts w:ascii="Khmer OS Battambang" w:hAnsi="Khmer OS Battambang" w:cs="Khmer OS Battambang" w:hint="cs"/>
+          <w:sz w:val="24"/>
+          <w:szCs w:val="24"/>
+          <w:cs/>
+        </w:rPr>
+        <w:t xml:space="preserve">យកតម្លៃពី </w:t>
+      </w:r>
+      <w:r>
+        <w:rPr>
+          <w:rFonts w:ascii="Khmer OS Battambang" w:hAnsi="Khmer OS Battambang" w:cs="Khmer OS Battambang"/>
+          <w:sz w:val="24"/>
+          <w:szCs w:val="24"/>
+        </w:rPr>
+        <w:t xml:space="preserve">component view to template </w:t>
+      </w:r>
+    </w:p>
+    <w:p>
+      <w:pPr>
+        <w:pStyle w:val="ListParagraph"/>
+        <w:numPr>
+          <w:ilvl w:val="0"/>
+          <w:numId w:val="4"/>
+        </w:numPr>
+        <w:rPr>
+          <w:rFonts w:ascii="Khmer OS Battambang" w:hAnsi="Khmer OS Battambang" w:cs="Khmer OS Battambang"/>
+          <w:sz w:val="20"/>
+          <w:szCs w:val="20"/>
+        </w:rPr>
+      </w:pPr>
+      <w:r>
+        <w:rPr>
+          <w:rFonts w:ascii="Khmer OS Battambang" w:hAnsi="Khmer OS Battambang" w:cs="Khmer OS Battambang"/>
+          <w:sz w:val="24"/>
+          <w:szCs w:val="24"/>
+        </w:rPr>
+        <w:t>(input)="</w:t>
+      </w:r>
+      <w:proofErr w:type="spellStart"/>
+      <w:r>
+        <w:rPr>
+          <w:rFonts w:ascii="Khmer OS Battambang" w:hAnsi="Khmer OS Battambang" w:cs="Khmer OS Battambang"/>
+          <w:sz w:val="24"/>
+          <w:szCs w:val="24"/>
+        </w:rPr>
+        <w:t>updateMonthlyAmount</w:t>
+      </w:r>
+      <w:proofErr w:type="spellEnd"/>
+      <w:r>
+        <w:rPr>
+          <w:rFonts w:ascii="Khmer OS Battambang" w:hAnsi="Khmer OS Battambang" w:cs="Khmer OS Battambang"/>
+          <w:sz w:val="24"/>
+          <w:szCs w:val="24"/>
+        </w:rPr>
+        <w:t>($event)"</w:t>
+      </w:r>
+      <w:r>
+        <w:rPr>
+          <w:rFonts w:ascii="Khmer OS Battambang" w:hAnsi="Khmer OS Battambang" w:cs="Khmer OS Battambang"/>
+          <w:sz w:val="24"/>
+          <w:szCs w:val="24"/>
+        </w:rPr>
+        <w:t xml:space="preserve">: it is the </w:t>
+      </w:r>
+      <w:r>
+        <w:rPr>
+          <w:rFonts w:ascii="Khmer OS Battambang" w:hAnsi="Khmer OS Battambang" w:cs="Khmer OS Battambang"/>
+          <w:color w:val="EE0000"/>
+          <w:sz w:val="24"/>
+          <w:szCs w:val="24"/>
+        </w:rPr>
+        <w:t>$event is a special keyword used in template event bindings to pass the native DOM event object from the browser into your component's TypeScript code.</w:t>
+      </w:r>
+      <w:r>
+        <w:rPr>
+          <w:rFonts w:ascii="Khmer OS Battambang" w:hAnsi="Khmer OS Battambang" w:cs="Khmer OS Battambang"/>
+          <w:color w:val="EE0000"/>
+          <w:sz w:val="24"/>
+          <w:szCs w:val="24"/>
+        </w:rPr>
+        <w:t xml:space="preserve"> </w:t>
+      </w:r>
+      <w:r>
+        <w:rPr>
+          <w:rFonts w:ascii="Khmer OS Battambang" w:hAnsi="Khmer OS Battambang" w:cs="Khmer OS Battambang" w:hint="cs"/>
+          <w:color w:val="EE0000"/>
+          <w:sz w:val="24"/>
+          <w:szCs w:val="24"/>
+          <w:cs/>
+        </w:rPr>
+        <w:t xml:space="preserve">សម្រាប់ធ្វើការរក្សាតម្លៃដែលវាជាព្រឹត្តិការណ៍ដែល </w:t>
+      </w:r>
+      <w:r>
+        <w:rPr>
+          <w:rFonts w:ascii="Khmer OS Battambang" w:hAnsi="Khmer OS Battambang" w:cs="Khmer OS Battambang"/>
+          <w:color w:val="EE0000"/>
+          <w:sz w:val="24"/>
+          <w:szCs w:val="24"/>
+        </w:rPr>
+        <w:t xml:space="preserve">User </w:t>
+      </w:r>
+      <w:r>
+        <w:rPr>
+          <w:rFonts w:ascii="Khmer OS Battambang" w:hAnsi="Khmer OS Battambang" w:cs="Khmer OS Battambang" w:hint="cs"/>
+          <w:color w:val="EE0000"/>
+          <w:sz w:val="24"/>
+          <w:szCs w:val="24"/>
+          <w:cs/>
+        </w:rPr>
+        <w:t xml:space="preserve">ធ្វើការ </w:t>
+      </w:r>
+    </w:p>
+    <w:p>
+      <w:pPr>
+        <w:ind w:left="360"/>
+        <w:rPr>
+          <w:rFonts w:ascii="Khmer OS Battambang" w:hAnsi="Khmer OS Battambang" w:cs="Khmer OS Battambang"/>
+          <w:sz w:val="20"/>
+          <w:szCs w:val="20"/>
+        </w:rPr>
+      </w:pPr>
+      <w:r>
+        <w:rPr>
+          <w:rFonts w:ascii="Khmer OS Battambang" w:hAnsi="Khmer OS Battambang" w:cs="Khmer OS Battambang"/>
+          <w:sz w:val="20"/>
+          <w:szCs w:val="20"/>
+        </w:rPr>
+        <w:drawing>
+          <wp:anchor distT="0" distB="0" distL="114300" distR="114300" simplePos="0" relativeHeight="251669504" behindDoc="1" locked="0" layoutInCell="1" allowOverlap="1" wp14:anchorId="54D93E73" wp14:editId="1EB5B6FD">
+            <wp:simplePos x="0" y="0"/>
+            <wp:positionH relativeFrom="column">
+              <wp:posOffset>506260</wp:posOffset>
+            </wp:positionH>
+            <wp:positionV relativeFrom="paragraph">
+              <wp:posOffset>108778</wp:posOffset>
+            </wp:positionV>
+            <wp:extent cx="4458322" cy="943107"/>
+            <wp:effectExtent l="0" t="0" r="0" b="9525"/>
+            <wp:wrapNone/>
+            <wp:docPr id="291745419" name="Picture 1"/>
+            <wp:cNvGraphicFramePr>
+              <a:graphicFrameLocks xmlns:a="http://schemas.openxmlformats.org/drawingml/2006/main" noChangeAspect="1"/>
+            </wp:cNvGraphicFramePr>
+            <a:graphic xmlns:a="http://schemas.openxmlformats.org/drawingml/2006/main">
+              <a:graphicData uri="http://schemas.openxmlformats.org/drawingml/2006/picture">
+                <pic:pic xmlns:pic="http://schemas.openxmlformats.org/drawingml/2006/picture">
+                  <pic:nvPicPr>
+                    <pic:cNvPr id="291745419" name=""/>
+                    <pic:cNvPicPr/>
+                  </pic:nvPicPr>
+                  <pic:blipFill>
+                    <a:blip r:embed="rId17">
+                      <a:extLst>
+                        <a:ext uri="{28A0092B-C50C-407E-A947-70E740481C1C}">
+                          <a14:useLocalDpi xmlns:a14="http://schemas.microsoft.com/office/drawing/2010/main" val="0"/>
+                        </a:ext>
+                      </a:extLst>
+                    </a:blip>
+                    <a:stretch>
+                      <a:fillRect/>
+                    </a:stretch>
+                  </pic:blipFill>
+                  <pic:spPr>
+                    <a:xfrm>
+                      <a:off x="0" y="0"/>
+                      <a:ext cx="4458322" cy="943107"/>
+                    </a:xfrm>
+                    <a:prstGeom prst="rect">
+                      <a:avLst/>
+                    </a:prstGeom>
+                  </pic:spPr>
+                </pic:pic>
+              </a:graphicData>
+            </a:graphic>
+          </wp:anchor>
+        </w:drawing>
+      </w:r>
+    </w:p>
+    <w:p>
+      <w:pPr>
+        <w:rPr>
+          <w:rFonts w:ascii="Khmer OS Battambang" w:hAnsi="Khmer OS Battambang" w:cs="Khmer OS Battambang"/>
+          <w:sz w:val="20"/>
+          <w:szCs w:val="20"/>
+        </w:rPr>
+      </w:pPr>
+    </w:p>
+    <w:p>
+      <w:pPr>
+        <w:rPr>
+          <w:rFonts w:ascii="Khmer OS Battambang" w:hAnsi="Khmer OS Battambang" w:cs="Khmer OS Battambang"/>
+          <w:sz w:val="20"/>
+          <w:szCs w:val="20"/>
+        </w:rPr>
+      </w:pPr>
+    </w:p>
+    <w:p>
+      <w:pPr>
+        <w:rPr>
+          <w:rFonts w:ascii="Khmer OS Battambang" w:hAnsi="Khmer OS Battambang" w:cs="Khmer OS Battambang"/>
+          <w:sz w:val="20"/>
+          <w:szCs w:val="20"/>
+        </w:rPr>
+      </w:pPr>
+    </w:p>
+    <w:p>
+      <w:pPr>
+        <w:rPr>
+          <w:rFonts w:ascii="Khmer OS Battambang" w:hAnsi="Khmer OS Battambang" w:cs="Khmer OS Battambang"/>
+          <w:sz w:val="20"/>
+          <w:szCs w:val="20"/>
+        </w:rPr>
+      </w:pPr>
+    </w:p>
+    <w:p>
+      <w:pPr>
+        <w:pStyle w:val="ListParagraph"/>
+        <w:numPr>
+          <w:ilvl w:val="0"/>
+          <w:numId w:val="4"/>
+        </w:numPr>
+        <w:rPr>
+          <w:rFonts w:ascii="Khmer OS Battambang" w:hAnsi="Khmer OS Battambang" w:cs="Khmer OS Battambang"/>
+          <w:sz w:val="20"/>
+          <w:szCs w:val="20"/>
+        </w:rPr>
+      </w:pPr>
+      <w:r>
+        <w:rPr>
+          <w:rFonts w:ascii="Khmer OS Battambang" w:hAnsi="Khmer OS Battambang" w:cs="Khmer OS Battambang" w:hint="cs"/>
+          <w:sz w:val="20"/>
+          <w:szCs w:val="20"/>
+          <w:cs/>
+        </w:rPr>
+        <w:t xml:space="preserve">ចឹងពេលដែលយើងធ្វើការ </w:t>
+      </w:r>
+      <w:r>
+        <w:rPr>
+          <w:rFonts w:ascii="Khmer OS Battambang" w:hAnsi="Khmer OS Battambang" w:cs="Khmer OS Battambang"/>
+          <w:sz w:val="20"/>
+          <w:szCs w:val="20"/>
+        </w:rPr>
+        <w:t xml:space="preserve">typing the $event </w:t>
+      </w:r>
+      <w:r>
+        <w:rPr>
+          <w:rFonts w:ascii="Khmer OS Battambang" w:hAnsi="Khmer OS Battambang" w:cs="Khmer OS Battambang" w:hint="cs"/>
+          <w:sz w:val="20"/>
+          <w:szCs w:val="20"/>
+          <w:cs/>
+        </w:rPr>
+        <w:t xml:space="preserve">នឹងវានឹងធ្វើការ </w:t>
+      </w:r>
+      <w:r>
+        <w:rPr>
+          <w:rFonts w:ascii="Khmer OS Battambang" w:hAnsi="Khmer OS Battambang" w:cs="Khmer OS Battambang"/>
+          <w:sz w:val="20"/>
+          <w:szCs w:val="20"/>
+        </w:rPr>
+        <w:t xml:space="preserve">listener every our typing </w:t>
+      </w:r>
+    </w:p>
+    <w:p>
+      <w:pPr>
+        <w:rPr>
+          <w:rFonts w:ascii="Khmer OS Battambang" w:hAnsi="Khmer OS Battambang" w:cs="Khmer OS Battambang"/>
+          <w:sz w:val="20"/>
+          <w:szCs w:val="20"/>
+        </w:rPr>
+      </w:pPr>
+    </w:p>
+    <w:p>
+      <w:pPr>
+        <w:rPr>
+          <w:rFonts w:ascii="Khmer OS Battambang" w:hAnsi="Khmer OS Battambang" w:cs="Khmer OS Battambang"/>
+          <w:sz w:val="20"/>
+          <w:szCs w:val="20"/>
+        </w:rPr>
+      </w:pPr>
+      <w:r>
+        <w:rPr>
+          <w:rFonts w:ascii="Khmer OS Battambang" w:hAnsi="Khmer OS Battambang" w:cs="Khmer OS Battambang"/>
+          <w:sz w:val="20"/>
+          <w:szCs w:val="20"/>
+        </w:rPr>
+        <w:t xml:space="preserve">Example on the </w:t>
+      </w:r>
+      <w:r>
+        <w:rPr>
+          <w:rFonts w:ascii="Khmer OS Battambang" w:hAnsi="Khmer OS Battambang" w:cs="Khmer OS Battambang"/>
+          <w:sz w:val="20"/>
+          <w:szCs w:val="20"/>
+        </w:rPr>
+        <w:t xml:space="preserve">(change) event </w:t>
+      </w:r>
+      <w:r>
+        <w:rPr>
+          <w:rFonts w:ascii="Khmer OS Battambang" w:hAnsi="Khmer OS Battambang" w:cs="Khmer OS Battambang"/>
+          <w:sz w:val="20"/>
+          <w:szCs w:val="20"/>
+        </w:rPr>
+        <w:t>(</w:t>
+      </w:r>
+      <w:r>
+        <w:rPr>
+          <w:rFonts w:ascii="Khmer OS Battambang" w:hAnsi="Khmer OS Battambang" w:cs="Khmer OS Battambang" w:hint="cs"/>
+          <w:sz w:val="20"/>
+          <w:szCs w:val="20"/>
+          <w:cs/>
+        </w:rPr>
+        <w:t xml:space="preserve">ពេលដែលយើងធ្វើការ ផ្លាសប្តូរ ហើយចេញពី កន្លែងប្តូរនឹងវានឹងធ្វើការ </w:t>
+      </w:r>
+      <w:r>
+        <w:rPr>
+          <w:rFonts w:ascii="Khmer OS Battambang" w:hAnsi="Khmer OS Battambang" w:cs="Khmer OS Battambang"/>
+          <w:sz w:val="20"/>
+          <w:szCs w:val="20"/>
+        </w:rPr>
+        <w:t xml:space="preserve">update now </w:t>
+      </w:r>
+    </w:p>
+    <w:p>
+      <w:pPr>
+        <w:rPr>
+          <w:rFonts w:ascii="Khmer OS Battambang" w:hAnsi="Khmer OS Battambang" w:cs="Khmer OS Battambang"/>
+          <w:sz w:val="20"/>
+          <w:szCs w:val="20"/>
+        </w:rPr>
+      </w:pPr>
+      <w:r>
+        <w:rPr>
+          <w:rFonts w:ascii="Khmer OS Battambang" w:hAnsi="Khmer OS Battambang" w:cs="Khmer OS Battambang"/>
+          <w:sz w:val="20"/>
+          <w:szCs w:val="20"/>
+        </w:rPr>
+        <w:drawing>
+          <wp:anchor distT="0" distB="0" distL="114300" distR="114300" simplePos="0" relativeHeight="251670528" behindDoc="1" locked="0" layoutInCell="1" allowOverlap="1" wp14:anchorId="626562B3" wp14:editId="69F10735">
+            <wp:simplePos x="0" y="0"/>
+            <wp:positionH relativeFrom="column">
+              <wp:posOffset>-1905</wp:posOffset>
+            </wp:positionH>
+            <wp:positionV relativeFrom="paragraph">
+              <wp:posOffset>129126</wp:posOffset>
+            </wp:positionV>
+            <wp:extent cx="6842125" cy="2007235"/>
+            <wp:effectExtent l="0" t="0" r="0" b="0"/>
+            <wp:wrapNone/>
+            <wp:docPr id="1172611653" name="Picture 1"/>
+            <wp:cNvGraphicFramePr>
+              <a:graphicFrameLocks xmlns:a="http://schemas.openxmlformats.org/drawingml/2006/main" noChangeAspect="1"/>
+            </wp:cNvGraphicFramePr>
+            <a:graphic xmlns:a="http://schemas.openxmlformats.org/drawingml/2006/main">
+              <a:graphicData uri="http://schemas.openxmlformats.org/drawingml/2006/picture">
+                <pic:pic xmlns:pic="http://schemas.openxmlformats.org/drawingml/2006/picture">
+                  <pic:nvPicPr>
+                    <pic:cNvPr id="1172611653" name=""/>
+                    <pic:cNvPicPr/>
+                  </pic:nvPicPr>
+                  <pic:blipFill>
+                    <a:blip r:embed="rId18">
+                      <a:extLst>
+                        <a:ext uri="{28A0092B-C50C-407E-A947-70E740481C1C}">
+                          <a14:useLocalDpi xmlns:a14="http://schemas.microsoft.com/office/drawing/2010/main" val="0"/>
+                        </a:ext>
+                      </a:extLst>
+                    </a:blip>
+                    <a:stretch>
+                      <a:fillRect/>
+                    </a:stretch>
+                  </pic:blipFill>
+                  <pic:spPr>
+                    <a:xfrm>
+                      <a:off x="0" y="0"/>
+                      <a:ext cx="6842125" cy="2007235"/>
+                    </a:xfrm>
+                    <a:prstGeom prst="rect">
+                      <a:avLst/>
+                    </a:prstGeom>
+                  </pic:spPr>
+                </pic:pic>
+              </a:graphicData>
+            </a:graphic>
+          </wp:anchor>
+        </w:drawing>
+      </w:r>
+    </w:p>
+    <w:p>
+      <w:pPr>
+        <w:rPr>
+          <w:rFonts w:ascii="Khmer OS Battambang" w:hAnsi="Khmer OS Battambang" w:cs="Khmer OS Battambang"/>
+          <w:sz w:val="20"/>
+          <w:szCs w:val="20"/>
+        </w:rPr>
+      </w:pPr>
+    </w:p>
+    <w:p>
+      <w:pPr>
+        <w:rPr>
+          <w:rFonts w:ascii="Khmer OS Battambang" w:hAnsi="Khmer OS Battambang" w:cs="Khmer OS Battambang"/>
+          <w:sz w:val="20"/>
+          <w:szCs w:val="20"/>
+        </w:rPr>
+      </w:pPr>
+    </w:p>
+    <w:p>
+      <w:pPr>
+        <w:rPr>
+          <w:rFonts w:ascii="Khmer OS Battambang" w:hAnsi="Khmer OS Battambang" w:cs="Khmer OS Battambang"/>
+          <w:sz w:val="20"/>
+          <w:szCs w:val="20"/>
+        </w:rPr>
+      </w:pPr>
+    </w:p>
+    <w:p>
+      <w:pPr>
+        <w:rPr>
+          <w:rFonts w:ascii="Khmer OS Battambang" w:hAnsi="Khmer OS Battambang" w:cs="Khmer OS Battambang"/>
+          <w:sz w:val="20"/>
+          <w:szCs w:val="20"/>
+        </w:rPr>
+      </w:pPr>
+    </w:p>
+    <w:p>
+      <w:pPr>
+        <w:rPr>
+          <w:rFonts w:ascii="Khmer OS Battambang" w:hAnsi="Khmer OS Battambang" w:cs="Khmer OS Battambang"/>
+          <w:sz w:val="20"/>
+          <w:szCs w:val="20"/>
+        </w:rPr>
+      </w:pPr>
+    </w:p>
+    <w:p>
+      <w:pPr>
+        <w:rPr>
+          <w:rFonts w:ascii="Khmer OS Battambang" w:hAnsi="Khmer OS Battambang" w:cs="Khmer OS Battambang"/>
+          <w:sz w:val="20"/>
+          <w:szCs w:val="20"/>
+        </w:rPr>
+      </w:pPr>
+    </w:p>
+    <w:p>
+      <w:pPr>
+        <w:rPr>
+          <w:rFonts w:ascii="Khmer OS Battambang" w:hAnsi="Khmer OS Battambang" w:cs="Khmer OS Battambang"/>
+          <w:sz w:val="20"/>
+          <w:szCs w:val="20"/>
+        </w:rPr>
+      </w:pPr>
+    </w:p>
+    <w:p>
+      <w:pPr>
+        <w:rPr>
+          <w:rFonts w:ascii="Khmer OS Battambang" w:hAnsi="Khmer OS Battambang" w:cs="Khmer OS Battambang"/>
+          <w:sz w:val="20"/>
+          <w:szCs w:val="20"/>
+        </w:rPr>
+      </w:pPr>
+    </w:p>
+    <w:p>
+      <w:pPr>
+        <w:rPr>
+          <w:rFonts w:ascii="Khmer OS Battambang" w:hAnsi="Khmer OS Battambang" w:cs="Khmer OS Battambang"/>
+          <w:sz w:val="20"/>
+          <w:szCs w:val="20"/>
+        </w:rPr>
+      </w:pPr>
+      <w:r>
+        <w:rPr>
+          <w:rFonts w:ascii="Khmer OS Battambang" w:hAnsi="Khmer OS Battambang" w:cs="Khmer OS Battambang"/>
+          <w:sz w:val="20"/>
+          <w:szCs w:val="20"/>
+        </w:rPr>
+        <w:drawing>
+          <wp:anchor distT="0" distB="0" distL="114300" distR="114300" simplePos="0" relativeHeight="251672576" behindDoc="1" locked="0" layoutInCell="1" allowOverlap="1" wp14:anchorId="6B94222F" wp14:editId="5377A27F">
+            <wp:simplePos x="0" y="0"/>
+            <wp:positionH relativeFrom="column">
+              <wp:posOffset>69657</wp:posOffset>
+            </wp:positionH>
+            <wp:positionV relativeFrom="paragraph">
+              <wp:posOffset>238125</wp:posOffset>
+            </wp:positionV>
+            <wp:extent cx="6677957" cy="2695951"/>
+            <wp:effectExtent l="0" t="0" r="8890" b="9525"/>
+            <wp:wrapNone/>
+            <wp:docPr id="1220836771" name="Picture 1"/>
+            <wp:cNvGraphicFramePr>
+              <a:graphicFrameLocks xmlns:a="http://schemas.openxmlformats.org/drawingml/2006/main" noChangeAspect="1"/>
+            </wp:cNvGraphicFramePr>
+            <a:graphic xmlns:a="http://schemas.openxmlformats.org/drawingml/2006/main">
+              <a:graphicData uri="http://schemas.openxmlformats.org/drawingml/2006/picture">
+                <pic:pic xmlns:pic="http://schemas.openxmlformats.org/drawingml/2006/picture">
+                  <pic:nvPicPr>
+                    <pic:cNvPr id="1220836771" name=""/>
+                    <pic:cNvPicPr/>
+                  </pic:nvPicPr>
+                  <pic:blipFill>
+                    <a:blip r:embed="rId19">
+                      <a:extLst>
+                        <a:ext uri="{28A0092B-C50C-407E-A947-70E740481C1C}">
+                          <a14:useLocalDpi xmlns:a14="http://schemas.microsoft.com/office/drawing/2010/main" val="0"/>
+                        </a:ext>
+                      </a:extLst>
+                    </a:blip>
+                    <a:stretch>
+                      <a:fillRect/>
+                    </a:stretch>
+                  </pic:blipFill>
+                  <pic:spPr>
+                    <a:xfrm>
+                      <a:off x="0" y="0"/>
+                      <a:ext cx="6677957" cy="2695951"/>
+                    </a:xfrm>
+                    <a:prstGeom prst="rect">
+                      <a:avLst/>
+                    </a:prstGeom>
+                  </pic:spPr>
+                </pic:pic>
+              </a:graphicData>
+            </a:graphic>
+          </wp:anchor>
+        </w:drawing>
+      </w:r>
+    </w:p>
+    <w:p>
+      <w:pPr>
+        <w:rPr>
+          <w:rFonts w:ascii="Khmer OS Battambang" w:hAnsi="Khmer OS Battambang" w:cs="Khmer OS Battambang"/>
+          <w:sz w:val="20"/>
+          <w:szCs w:val="20"/>
+        </w:rPr>
+      </w:pPr>
+    </w:p>
+    <w:p>
+      <w:pPr>
+        <w:rPr>
+          <w:rFonts w:ascii="Khmer OS Battambang" w:hAnsi="Khmer OS Battambang" w:cs="Khmer OS Battambang"/>
+          <w:sz w:val="20"/>
+          <w:szCs w:val="20"/>
+        </w:rPr>
+      </w:pPr>
+    </w:p>
+    <w:p>
+      <w:pPr>
+        <w:rPr>
+          <w:rFonts w:ascii="Khmer OS Battambang" w:hAnsi="Khmer OS Battambang" w:cs="Khmer OS Battambang"/>
+          <w:sz w:val="20"/>
+          <w:szCs w:val="20"/>
+        </w:rPr>
+      </w:pPr>
+    </w:p>
+    <w:p>
+      <w:pPr>
+        <w:rPr>
+          <w:rFonts w:ascii="Khmer OS Battambang" w:hAnsi="Khmer OS Battambang" w:cs="Khmer OS Battambang"/>
+          <w:sz w:val="20"/>
+          <w:szCs w:val="20"/>
+        </w:rPr>
+      </w:pPr>
+    </w:p>
+    <w:p>
+      <w:pPr>
+        <w:rPr>
+          <w:rFonts w:ascii="Khmer OS Battambang" w:hAnsi="Khmer OS Battambang" w:cs="Khmer OS Battambang"/>
+          <w:sz w:val="20"/>
+          <w:szCs w:val="20"/>
+        </w:rPr>
+      </w:pPr>
+    </w:p>
+    <w:p>
+      <w:pPr>
+        <w:rPr>
+          <w:rFonts w:ascii="Khmer OS Battambang" w:hAnsi="Khmer OS Battambang" w:cs="Khmer OS Battambang"/>
+          <w:sz w:val="20"/>
+          <w:szCs w:val="20"/>
+        </w:rPr>
+      </w:pPr>
+    </w:p>
+    <w:p>
+      <w:pPr>
+        <w:rPr>
+          <w:rFonts w:ascii="Khmer OS Battambang" w:hAnsi="Khmer OS Battambang" w:cs="Khmer OS Battambang"/>
+          <w:sz w:val="20"/>
+          <w:szCs w:val="20"/>
+        </w:rPr>
+      </w:pPr>
+    </w:p>
+    <w:p>
+      <w:pPr>
+        <w:rPr>
+          <w:rFonts w:ascii="Khmer OS Battambang" w:hAnsi="Khmer OS Battambang" w:cs="Khmer OS Battambang"/>
+          <w:sz w:val="20"/>
+          <w:szCs w:val="20"/>
+        </w:rPr>
+      </w:pPr>
+    </w:p>
+    <w:p>
+      <w:pPr>
+        <w:rPr>
+          <w:rFonts w:ascii="Khmer OS Battambang" w:hAnsi="Khmer OS Battambang" w:cs="Khmer OS Battambang"/>
+          <w:sz w:val="20"/>
+          <w:szCs w:val="20"/>
+        </w:rPr>
+      </w:pPr>
+    </w:p>
+    <w:p>
+      <w:pPr>
+        <w:rPr>
+          <w:rFonts w:ascii="Khmer OS Battambang" w:hAnsi="Khmer OS Battambang" w:cs="Khmer OS Battambang"/>
+          <w:sz w:val="20"/>
+          <w:szCs w:val="20"/>
+        </w:rPr>
+      </w:pPr>
+    </w:p>
+    <w:p>
+      <w:pPr>
+        <w:rPr>
+          <w:rFonts w:ascii="Khmer OS Battambang" w:hAnsi="Khmer OS Battambang" w:cs="Khmer OS Battambang"/>
+          <w:sz w:val="20"/>
+          <w:szCs w:val="20"/>
+        </w:rPr>
+      </w:pPr>
+    </w:p>
+    <w:p>
+      <w:pPr>
+        <w:rPr>
+          <w:rFonts w:ascii="Khmer OS Battambang" w:hAnsi="Khmer OS Battambang" w:cs="Khmer OS Battambang"/>
+          <w:sz w:val="20"/>
+          <w:szCs w:val="20"/>
+        </w:rPr>
+      </w:pPr>
+      <w:r>
+        <w:rPr>
+          <w:rFonts w:ascii="Khmer OS Battambang" w:hAnsi="Khmer OS Battambang" w:cs="Khmer OS Battambang"/>
+          <w:sz w:val="20"/>
+          <w:szCs w:val="20"/>
+        </w:rPr>
+        <w:lastRenderedPageBreak/>
+        <w:drawing>
+          <wp:anchor distT="0" distB="0" distL="114300" distR="114300" simplePos="0" relativeHeight="251671552" behindDoc="1" locked="0" layoutInCell="1" allowOverlap="1" wp14:anchorId="59F01EE4" wp14:editId="429FE4CD">
+            <wp:simplePos x="0" y="0"/>
+            <wp:positionH relativeFrom="column">
+              <wp:posOffset>1222596</wp:posOffset>
+            </wp:positionH>
+            <wp:positionV relativeFrom="paragraph">
+              <wp:posOffset>53754</wp:posOffset>
+            </wp:positionV>
+            <wp:extent cx="4276066" cy="2870421"/>
+            <wp:effectExtent l="0" t="0" r="0" b="6350"/>
+            <wp:wrapNone/>
+            <wp:docPr id="261889930" name="Picture 1"/>
+            <wp:cNvGraphicFramePr>
+              <a:graphicFrameLocks xmlns:a="http://schemas.openxmlformats.org/drawingml/2006/main" noChangeAspect="1"/>
+            </wp:cNvGraphicFramePr>
+            <a:graphic xmlns:a="http://schemas.openxmlformats.org/drawingml/2006/main">
+              <a:graphicData uri="http://schemas.openxmlformats.org/drawingml/2006/picture">
+                <pic:pic xmlns:pic="http://schemas.openxmlformats.org/drawingml/2006/picture">
+                  <pic:nvPicPr>
+                    <pic:cNvPr id="261889930" name=""/>
+                    <pic:cNvPicPr/>
+                  </pic:nvPicPr>
+                  <pic:blipFill>
+                    <a:blip r:embed="rId20">
+                      <a:extLst>
+                        <a:ext uri="{28A0092B-C50C-407E-A947-70E740481C1C}">
+                          <a14:useLocalDpi xmlns:a14="http://schemas.microsoft.com/office/drawing/2010/main" val="0"/>
+                        </a:ext>
+                      </a:extLst>
+                    </a:blip>
+                    <a:stretch>
+                      <a:fillRect/>
+                    </a:stretch>
+                  </pic:blipFill>
+                  <pic:spPr>
+                    <a:xfrm>
+                      <a:off x="0" y="0"/>
+                      <a:ext cx="4276066" cy="2870421"/>
+                    </a:xfrm>
+                    <a:prstGeom prst="rect">
+                      <a:avLst/>
+                    </a:prstGeom>
+                  </pic:spPr>
+                </pic:pic>
+              </a:graphicData>
+            </a:graphic>
+            <wp14:sizeRelH relativeFrom="margin">
+              <wp14:pctWidth>0</wp14:pctWidth>
+            </wp14:sizeRelH>
+            <wp14:sizeRelV relativeFrom="margin">
+              <wp14:pctHeight>0</wp14:pctHeight>
+            </wp14:sizeRelV>
+          </wp:anchor>
+        </w:drawing>
+      </w:r>
     </w:p>
     <w:sectPr>
       <w:pgSz w:w="11909" w:h="16834" w:code="9"/>

</xml_diff>